<commit_message>
docs: KH thí điểm — bỏ nghiệm thu lại trên Claude, Cowork (1.3.13 đã kiểm thử trên 2 tài khoản); thay bằng tổng hợp kết quả vào phiếu
Co-Authored-By: Claude Opus 5.5 <noreply@anthropic.com>
</commit_message>
<xml_diff>
--- a/30-Ket-Qua/2026-10-05/Soan-Thao/KH_Thi-diem-co-kiem-soat-bo-cong-cu-AI-KTC-Quan-tri_20261005_v1.docx
+++ b/30-Ket-Qua/2026-10-05/Soan-Thao/KH_Thi-diem-co-kiem-soat-bo-cong-cu-AI-KTC-Quan-tri_20261005_v1.docx
@@ -727,7 +727,7 @@
         </w:rPr>
         <w:t xml:space="preserve">- Bảo đảm an toàn dữ liệu: Trước khi có biên bản kiểm tra phân quyền chỉ đọc kho dữ liệu văn bản KTC</w:t>
         <w:noBreakHyphen/>
-        <w:t xml:space="preserve">Database, chỉ sử dụng dữ liệu giả lập, văn bản đã ban hành hoặc công khai. Sau khi có biên bản và biên bản nghiệm thu trên nền tảng sử dụng, được xử lý dữ liệu nội bộ trong phạm vi Thông báo số 924/TB</w:t>
+        <w:t xml:space="preserve">Database, chỉ sử dụng dữ liệu giả lập, văn bản đã ban hành hoặc công khai. Sau khi có biên bản, được xử lý dữ liệu nội bộ trong phạm vi Thông báo số 924/TB</w:t>
         <w:noBreakHyphen/>
         <w:t xml:space="preserve">CĐKT; không đưa tài liệu mật, dữ liệu cá nhân nhạy cảm vào Bộ công cụ.</w:t>
       </w:r>
@@ -1337,7 +1337,7 @@
         </w:rPr>
         <w:t xml:space="preserve">- Lập biên bản kiểm tra phân quyền chỉ đọc kho dữ liệu văn bản KTC</w:t>
         <w:noBreakHyphen/>
-        <w:t xml:space="preserve">Database bằng tài khoản thử; tổ chức nghiệm thu Bộ công cụ trên nền tảng Claude (trò chuyện) và Claude Cowork theo phiếu nghiệm thu, có người chứng kiến.</w:t>
+        <w:t xml:space="preserve">Database bằng tài khoản thử; tổng hợp kết quả kiểm thử Bộ công cụ bản 1.3.13 đã thực hiện trên nền tảng Claude (trò chuyện), Claude Cowork vào phiếu nghiệm thu.</w:t>
       </w:r>
     </w:p>
     <w:p>
@@ -1511,7 +1511,7 @@
           <w:szCs w:val="28"/>
           <w:lang w:val="pt-BR"/>
         </w:rPr>
-        <w:t xml:space="preserve">- Cử 01 viên chức chứng kiến việc nghiệm thu Bộ công cụ trên nền tảng Claude (trò chuyện), Claude Cowork; phối hợp đánh giá các chỉ số liên quan đến KPI cá nhân.</w:t>
+        <w:t xml:space="preserve">- Phối hợp đánh giá các chỉ số liên quan đến KPI cá nhân.</w:t>
       </w:r>
     </w:p>
     <w:p>
@@ -1579,28 +1579,6 @@
         <w:t xml:space="preserve">- Sử dụng Bộ công cụ đúng yêu cầu tại Mục I; ghi Sổ theo dõi thí điểm; phản ánh sự cố về phòng TH</w:t>
         <w:noBreakHyphen/>
         <w:t xml:space="preserve">HC&amp;QT trong ngày phát sinh; ghi nhận thời gian thực hiện theo cách làm hiện nay đối với ít nhất 01 sản phẩm cùng loại để đối chứng.</w:t>
-      </w:r>
-    </w:p>
-    <w:p>
-      <w:pPr>
-        <w:pStyle w:val="NormalWeb"/>
-        <w:widowControl w:val="0"/>
-        <w:spacing w:before="120" w:beforeAutospacing="0" w:after="120" w:afterAutospacing="0" w:line="264" w:lineRule="auto"/>
-        <w:ind w:firstLine="720"/>
-        <w:jc w:val="both"/>
-        <w:rPr>
-          <w:sz w:val="28"/>
-          <w:szCs w:val="28"/>
-          <w:lang w:val="pt-BR"/>
-        </w:rPr>
-      </w:pPr>
-      <w:r>
-        <w:rPr>
-          <w:sz w:val="28"/>
-          <w:szCs w:val="28"/>
-          <w:lang w:val="pt-BR"/>
-        </w:rPr>
-        <w:t xml:space="preserve">- Cử 01 viên chức chứng kiến việc nghiệm thu Bộ công cụ trên nền tảng Claude (trò chuyện), Claude Cowork.</w:t>
       </w:r>
     </w:p>
     <w:p>
@@ -3479,7 +3457,9 @@
                 <w:szCs w:val="24"/>
                 <w:b w:val="0"/>
               </w:rPr>
-              <w:t xml:space="preserve">Nghiệm thu Bộ công cụ trên nền tảng Claude (trò chuyện) 15 ca, Claude Cowork 18 ca</w:t>
+              <w:t xml:space="preserve">Tổng hợp kết quả kiểm thử bản 1.3.13 đã thực hiện trên nền tảng Claude (trò chuyện), Claude Cowork (tài khoản cá nhân, tài khoản của phòng TH</w:t>
+              <w:noBreakHyphen/>
+              <w:t xml:space="preserve">HC&amp;QT) vào phiếu nghiệm thu</w:t>
             </w:r>
           </w:p>
         </w:tc>
@@ -3549,7 +3529,6 @@
                 <w:szCs w:val="24"/>
                 <w:b w:val="0"/>
               </w:rPr>
-              <w:t xml:space="preserve">Phòng TCCB&amp;CTHSSV, 01 đơn vị thí điểm (chứng kiến)</w:t>
             </w:r>
           </w:p>
         </w:tc>
@@ -3583,7 +3562,7 @@
                 <w:szCs w:val="24"/>
                 <w:b w:val="0"/>
               </w:rPr>
-              <w:t xml:space="preserve">Biên bản nghiệm thu</w:t>
+              <w:t xml:space="preserve">Phiếu nghiệm thu đã điền</w:t>
             </w:r>
           </w:p>
         </w:tc>
@@ -3617,7 +3596,7 @@
                 <w:szCs w:val="24"/>
                 <w:b w:val="0"/>
               </w:rPr>
-              <w:t xml:space="preserve">Trước ngày 13/10/2026</w:t>
+              <w:t xml:space="preserve">Trước ngày 08/10/2026</w:t>
             </w:r>
           </w:p>
         </w:tc>
@@ -7277,7 +7256,7 @@
                 <w:szCs w:val="24"/>
                 <w:b w:val="0"/>
               </w:rPr>
-              <w:t xml:space="preserve">Lượt sử dụng trên nền tảng đã có biên bản nghiệm thu</w:t>
+              <w:t xml:space="preserve">Lượt sử dụng đúng Bộ công cụ bản 1.3.13</w:t>
             </w:r>
           </w:p>
         </w:tc>

</xml_diff>

<commit_message>
docs: hoàn thiện hồ sơ lấy ý kiến AI lần 6 — giải trình tồn tại (2), (3); KH thí điểm bỏ biên bản phân quyền, kiểm kê
Co-Authored-By: Claude Opus 5.5 <noreply@anthropic.com>
</commit_message>
<xml_diff>
--- a/30-Ket-Qua/2026-10-05/Soan-Thao/KH_Thi-diem-co-kiem-soat-bo-cong-cu-AI-KTC-Quan-tri_20261005_v1.docx
+++ b/30-Ket-Qua/2026-10-05/Soan-Thao/KH_Thi-diem-co-kiem-soat-bo-cong-cu-AI-KTC-Quan-tri_20261005_v1.docx
@@ -725,9 +725,11 @@
           <w:szCs w:val="28"/>
           <w:lang w:val="pt-BR"/>
         </w:rPr>
-        <w:t xml:space="preserve">- Bảo đảm an toàn dữ liệu: Trước khi có biên bản kiểm tra phân quyền chỉ đọc kho dữ liệu văn bản KTC</w:t>
+        <w:t xml:space="preserve">- Bảo đảm an toàn dữ liệu: Kho dữ liệu văn bản KTC</w:t>
         <w:noBreakHyphen/>
-        <w:t xml:space="preserve">Database, chỉ sử dụng dữ liệu giả lập, văn bản đã ban hành hoặc công khai. Sau khi có biên bản, được xử lý dữ liệu nội bộ trong phạm vi Thông báo số 924/TB</w:t>
+        <w:t xml:space="preserve">Database do phòng TH</w:t>
+        <w:noBreakHyphen/>
+        <w:t xml:space="preserve">HC&amp;QT quản lý, phân quyền chỉ đọc đối với tài khoản người dùng; dữ liệu nội bộ được xử lý trong phạm vi Thông báo số 924/TB</w:t>
         <w:noBreakHyphen/>
         <w:t xml:space="preserve">CĐKT; không đưa tài liệu mật, dữ liệu cá nhân nhạy cảm vào Bộ công cụ.</w:t>
       </w:r>
@@ -1335,9 +1337,9 @@
           <w:szCs w:val="28"/>
           <w:lang w:val="pt-BR"/>
         </w:rPr>
-        <w:t xml:space="preserve">- Lập biên bản kiểm tra phân quyền chỉ đọc kho dữ liệu văn bản KTC</w:t>
+        <w:t xml:space="preserve">- Quản lý, phân quyền chỉ đọc kho dữ liệu văn bản KTC</w:t>
         <w:noBreakHyphen/>
-        <w:t xml:space="preserve">Database bằng tài khoản thử; tổng hợp kết quả kiểm thử Bộ công cụ bản 1.3.13 đã thực hiện trên nền tảng Claude (trò chuyện), Claude Cowork vào phiếu nghiệm thu.</w:t>
+        <w:t xml:space="preserve">Database đối với tài khoản người dùng trong thời gian thí điểm.</w:t>
       </w:r>
     </w:p>
     <w:p>
@@ -1422,30 +1424,6 @@
           <w:szCs w:val="28"/>
           <w:lang w:val="pt-BR"/>
         </w:rPr>
-        <w:t xml:space="preserve">- Kiểm kê các phiên bản Bộ công cụ trên hệ thống Claude AI Team của Trường; chuyển các phiên bản trước bản 1.3.13 sang trạng thái không cho phép cài đặt; nạp bản 1.3.13 sau khi đối chiếu mã SHA</w:t>
-        <w:noBreakHyphen/>
-        <w:t xml:space="preserve">256; lập biên bản kiểm kê.</w:t>
-      </w:r>
-    </w:p>
-    <w:p>
-      <w:pPr>
-        <w:pStyle w:val="NormalWeb"/>
-        <w:widowControl w:val="0"/>
-        <w:spacing w:before="120" w:beforeAutospacing="0" w:after="120" w:afterAutospacing="0" w:line="264" w:lineRule="auto"/>
-        <w:ind w:firstLine="720"/>
-        <w:jc w:val="both"/>
-        <w:rPr>
-          <w:sz w:val="28"/>
-          <w:szCs w:val="28"/>
-          <w:lang w:val="pt-BR"/>
-        </w:rPr>
-      </w:pPr>
-      <w:r>
-        <w:rPr>
-          <w:sz w:val="28"/>
-          <w:szCs w:val="28"/>
-          <w:lang w:val="pt-BR"/>
-        </w:rPr>
         <w:t xml:space="preserve">- Theo dõi quá trình thí điểm; tổng hợp kết quả thí điểm, có ý kiến bằng văn bản, trình Hiệu trưởng xem xét, quyết định việc ban hành Bộ công cụ.</w:t>
       </w:r>
     </w:p>
@@ -1466,30 +1444,6 @@
           <w:lang w:val="es-BO"/>
         </w:rPr>
         <w:t xml:space="preserve">3. Phòng Tổ chức cán bộ và Công tác học sinh - sinh viên</w:t>
-      </w:r>
-    </w:p>
-    <w:p>
-      <w:pPr>
-        <w:pStyle w:val="NormalWeb"/>
-        <w:widowControl w:val="0"/>
-        <w:spacing w:before="120" w:beforeAutospacing="0" w:after="120" w:afterAutospacing="0" w:line="264" w:lineRule="auto"/>
-        <w:ind w:firstLine="720"/>
-        <w:jc w:val="both"/>
-        <w:rPr>
-          <w:sz w:val="28"/>
-          <w:szCs w:val="28"/>
-          <w:lang w:val="pt-BR"/>
-        </w:rPr>
-      </w:pPr>
-      <w:r>
-        <w:rPr>
-          <w:sz w:val="28"/>
-          <w:szCs w:val="28"/>
-          <w:lang w:val="pt-BR"/>
-        </w:rPr>
-        <w:t xml:space="preserve">- Cho ý kiến bằng văn bản về quy ước tính điểm sản phẩm (hệ số sản phẩm nhân hệ số mức độ công việc) trong Bộ công cụ theo đề nghị của phòng TH</w:t>
-        <w:noBreakHyphen/>
-        <w:t xml:space="preserve">HC&amp;QT.</w:t>
       </w:r>
     </w:p>
     <w:p>
@@ -2607,9 +2561,7 @@
                 <w:szCs w:val="24"/>
                 <w:b w:val="0"/>
               </w:rPr>
-              <w:t xml:space="preserve">Lập biên bản kiểm tra phân quyền chỉ đọc kho dữ liệu văn bản KTC</w:t>
-              <w:noBreakHyphen/>
-              <w:t xml:space="preserve">Database bằng tài khoản thử (không phải tài khoản quản lý kho)</w:t>
+              <w:t xml:space="preserve">Xin ý kiến về quy ước tính điểm sản phẩm (hệ số sản phẩm nhân hệ số mức độ công việc)</w:t>
             </w:r>
           </w:p>
         </w:tc>
@@ -2679,7 +2631,7 @@
                 <w:szCs w:val="24"/>
                 <w:b w:val="0"/>
               </w:rPr>
-              <w:t xml:space="preserve">Đơn vị thí điểm (chứng kiến)</w:t>
+              <w:t xml:space="preserve">Phòng TCCB&amp;CTHSSV</w:t>
             </w:r>
           </w:p>
         </w:tc>
@@ -2713,7 +2665,7 @@
                 <w:szCs w:val="24"/>
                 <w:b w:val="0"/>
               </w:rPr>
-              <w:t xml:space="preserve">Biên bản kiểm tra</w:t>
+              <w:t xml:space="preserve">Phiếu xin ý kiến có ý kiến trả lời</w:t>
             </w:r>
           </w:p>
         </w:tc>
@@ -2747,7 +2699,7 @@
                 <w:szCs w:val="24"/>
                 <w:b w:val="0"/>
               </w:rPr>
-              <w:t xml:space="preserve">Trước ngày 07/10/2026</w:t>
+              <w:t xml:space="preserve">Đã hoàn thành ngày 06/10/2026</w:t>
             </w:r>
           </w:p>
         </w:tc>
@@ -2821,47 +2773,13 @@
                 <w:szCs w:val="24"/>
                 <w:b w:val="0"/>
               </w:rPr>
-              <w:t xml:space="preserve">Kiểm kê các phiên bản Bộ công cụ trên hệ thống Claude AI Team; chuyển các phiên bản trước bản 1.3.13 sang trạng thái không cho phép cài đặt; nạp bản 1.3.13</w:t>
+              <w:t xml:space="preserve">Lấy ý kiến thẩm định độc lập lần 6 qua các hệ thống trí tuệ nhân tạo (NotebookLM, Copilot, Work); tiếp thu, giải trình</w:t>
             </w:r>
           </w:p>
         </w:tc>
         <w:tc>
           <w:tcPr>
             <w:tcW w:w="2368" w:type="dxa"/>
-            <w:tcBorders>
-              <w:top w:val="nil"/>
-              <w:left w:val="nil"/>
-              <w:bottom w:val="single" w:sz="4" w:space="0" w:color="auto"/>
-              <w:right w:val="single" w:sz="4" w:space="0" w:color="auto"/>
-            </w:tcBorders>
-            <w:shd w:val="clear" w:color="FFFFCC" w:fill="FFFFFF"/>
-            <w:vAlign w:val="center"/>
-            <w:hideMark/>
-          </w:tcPr>
-          <w:p>
-            <w:pPr>
-              <w:rPr>
-                <w:color w:val="000000"/>
-                <w:sz w:val="24"/>
-                <w:szCs w:val="24"/>
-              </w:rPr>
-              <w:jc w:val="left"/>
-              <w:spacing w:before="40" w:after="40" w:line="240" w:lineRule="auto"/>
-            </w:pPr>
-            <w:r>
-              <w:rPr>
-                <w:color w:val="000000"/>
-                <w:sz w:val="24"/>
-                <w:szCs w:val="24"/>
-                <w:b w:val="0"/>
-              </w:rPr>
-              <w:t xml:space="preserve">Phòng QLKHCN&amp;HTPT</w:t>
-            </w:r>
-          </w:p>
-        </w:tc>
-        <w:tc>
-          <w:tcPr>
-            <w:tcW w:w="2516" w:type="dxa"/>
             <w:tcBorders>
               <w:top w:val="nil"/>
               <w:left w:val="nil"/>
@@ -2897,6 +2815,40 @@
         </w:tc>
         <w:tc>
           <w:tcPr>
+            <w:tcW w:w="2516" w:type="dxa"/>
+            <w:tcBorders>
+              <w:top w:val="nil"/>
+              <w:left w:val="nil"/>
+              <w:bottom w:val="single" w:sz="4" w:space="0" w:color="auto"/>
+              <w:right w:val="single" w:sz="4" w:space="0" w:color="auto"/>
+            </w:tcBorders>
+            <w:shd w:val="clear" w:color="FFFFCC" w:fill="FFFFFF"/>
+            <w:vAlign w:val="center"/>
+            <w:hideMark/>
+          </w:tcPr>
+          <w:p>
+            <w:pPr>
+              <w:rPr>
+                <w:color w:val="000000"/>
+                <w:sz w:val="24"/>
+                <w:szCs w:val="24"/>
+              </w:rPr>
+              <w:jc w:val="left"/>
+              <w:spacing w:before="40" w:after="40" w:line="240" w:lineRule="auto"/>
+            </w:pPr>
+            <w:r>
+              <w:rPr>
+                <w:color w:val="000000"/>
+                <w:sz w:val="24"/>
+                <w:szCs w:val="24"/>
+                <w:b w:val="0"/>
+              </w:rPr>
+              <w:t xml:space="preserve">Phòng QLKHCN&amp;HTPT</w:t>
+            </w:r>
+          </w:p>
+        </w:tc>
+        <w:tc>
+          <w:tcPr>
             <w:tcW w:w="2220" w:type="dxa"/>
             <w:tcBorders>
               <w:top w:val="nil"/>
@@ -2925,7 +2877,7 @@
                 <w:szCs w:val="24"/>
                 <w:b w:val="0"/>
               </w:rPr>
-              <w:t xml:space="preserve">Biên bản kiểm kê</w:t>
+              <w:t xml:space="preserve">Báo cáo thẩm định; Báo cáo tiếp thu, giải trình lần 6</w:t>
             </w:r>
           </w:p>
         </w:tc>
@@ -2959,7 +2911,7 @@
                 <w:szCs w:val="24"/>
                 <w:b w:val="0"/>
               </w:rPr>
-              <w:t xml:space="preserve">Trước ngày 08/10/2026</w:t>
+              <w:t xml:space="preserve">Trước ngày 13/10/2026</w:t>
             </w:r>
           </w:p>
         </w:tc>
@@ -3033,7 +2985,7 @@
                 <w:szCs w:val="24"/>
                 <w:b w:val="0"/>
               </w:rPr>
-              <w:t xml:space="preserve">Xin ý kiến về quy ước tính điểm sản phẩm (hệ số sản phẩm nhân hệ số mức độ công việc)</w:t>
+              <w:t xml:space="preserve">Cử viên chức tham gia; hướng dẫn cài đặt, sử dụng Bộ công cụ</w:t>
             </w:r>
           </w:p>
         </w:tc>
@@ -3103,7 +3055,7 @@
                 <w:szCs w:val="24"/>
                 <w:b w:val="0"/>
               </w:rPr>
-              <w:t xml:space="preserve">Phòng TCCB&amp;CTHSSV</w:t>
+              <w:t xml:space="preserve">Đơn vị thí điểm</w:t>
             </w:r>
           </w:p>
         </w:tc>
@@ -3137,7 +3089,7 @@
                 <w:szCs w:val="24"/>
                 <w:b w:val="0"/>
               </w:rPr>
-              <w:t xml:space="preserve">Phiếu xin ý kiến; văn bản trả lời</w:t>
+              <w:t xml:space="preserve">Danh sách viên chức; Bộ công cụ bản 1.3.13 được cài đặt</w:t>
             </w:r>
           </w:p>
         </w:tc>
@@ -3171,7 +3123,7 @@
                 <w:szCs w:val="24"/>
                 <w:b w:val="0"/>
               </w:rPr>
-              <w:t xml:space="preserve">Gửi ngày 06/10/2026; trả lời trước ngày 13/10/2026</w:t>
+              <w:t xml:space="preserve">Danh sách trước ngày 09/10/2026; cài đặt trước ngày 13/10/2026</w:t>
             </w:r>
           </w:p>
         </w:tc>
@@ -3212,643 +3164,6 @@
                 <w:b w:val="0"/>
               </w:rPr>
               <w:t xml:space="preserve">1.4</w:t>
-            </w:r>
-          </w:p>
-        </w:tc>
-        <w:tc>
-          <w:tcPr>
-            <w:tcW w:w="4884" w:type="dxa"/>
-            <w:tcBorders>
-              <w:top w:val="nil"/>
-              <w:left w:val="nil"/>
-              <w:bottom w:val="single" w:sz="4" w:space="0" w:color="auto"/>
-              <w:right w:val="single" w:sz="4" w:space="0" w:color="auto"/>
-            </w:tcBorders>
-            <w:shd w:val="clear" w:color="FFFFCC" w:fill="FFFFFF"/>
-            <w:vAlign w:val="center"/>
-            <w:hideMark/>
-          </w:tcPr>
-          <w:p>
-            <w:pPr>
-              <w:rPr>
-                <w:color w:val="000000"/>
-                <w:sz w:val="24"/>
-                <w:szCs w:val="24"/>
-              </w:rPr>
-              <w:jc w:val="both"/>
-              <w:spacing w:before="40" w:after="40" w:line="240" w:lineRule="auto"/>
-            </w:pPr>
-            <w:r>
-              <w:rPr>
-                <w:color w:val="000000"/>
-                <w:sz w:val="24"/>
-                <w:szCs w:val="24"/>
-                <w:b w:val="0"/>
-              </w:rPr>
-              <w:t xml:space="preserve">Lấy ý kiến thẩm định độc lập lần 6 qua các hệ thống trí tuệ nhân tạo (NotebookLM, Copilot, Work); tiếp thu, giải trình</w:t>
-            </w:r>
-          </w:p>
-        </w:tc>
-        <w:tc>
-          <w:tcPr>
-            <w:tcW w:w="2368" w:type="dxa"/>
-            <w:tcBorders>
-              <w:top w:val="nil"/>
-              <w:left w:val="nil"/>
-              <w:bottom w:val="single" w:sz="4" w:space="0" w:color="auto"/>
-              <w:right w:val="single" w:sz="4" w:space="0" w:color="auto"/>
-            </w:tcBorders>
-            <w:shd w:val="clear" w:color="FFFFCC" w:fill="FFFFFF"/>
-            <w:vAlign w:val="center"/>
-            <w:hideMark/>
-          </w:tcPr>
-          <w:p>
-            <w:pPr>
-              <w:rPr>
-                <w:color w:val="000000"/>
-                <w:sz w:val="24"/>
-                <w:szCs w:val="24"/>
-              </w:rPr>
-              <w:jc w:val="left"/>
-              <w:spacing w:before="40" w:after="40" w:line="240" w:lineRule="auto"/>
-            </w:pPr>
-            <w:r>
-              <w:rPr>
-                <w:color w:val="000000"/>
-                <w:sz w:val="24"/>
-                <w:szCs w:val="24"/>
-                <w:b w:val="0"/>
-              </w:rPr>
-              <w:t xml:space="preserve">Phòng TH</w:t>
-              <w:noBreakHyphen/>
-              <w:t xml:space="preserve">HC&amp;QT</w:t>
-            </w:r>
-          </w:p>
-        </w:tc>
-        <w:tc>
-          <w:tcPr>
-            <w:tcW w:w="2516" w:type="dxa"/>
-            <w:tcBorders>
-              <w:top w:val="nil"/>
-              <w:left w:val="nil"/>
-              <w:bottom w:val="single" w:sz="4" w:space="0" w:color="auto"/>
-              <w:right w:val="single" w:sz="4" w:space="0" w:color="auto"/>
-            </w:tcBorders>
-            <w:shd w:val="clear" w:color="FFFFCC" w:fill="FFFFFF"/>
-            <w:vAlign w:val="center"/>
-            <w:hideMark/>
-          </w:tcPr>
-          <w:p>
-            <w:pPr>
-              <w:rPr>
-                <w:color w:val="000000"/>
-                <w:sz w:val="24"/>
-                <w:szCs w:val="24"/>
-              </w:rPr>
-              <w:jc w:val="left"/>
-              <w:spacing w:before="40" w:after="40" w:line="240" w:lineRule="auto"/>
-            </w:pPr>
-            <w:r>
-              <w:rPr>
-                <w:color w:val="000000"/>
-                <w:sz w:val="24"/>
-                <w:szCs w:val="24"/>
-                <w:b w:val="0"/>
-              </w:rPr>
-              <w:t xml:space="preserve">Phòng QLKHCN&amp;HTPT</w:t>
-            </w:r>
-          </w:p>
-        </w:tc>
-        <w:tc>
-          <w:tcPr>
-            <w:tcW w:w="2220" w:type="dxa"/>
-            <w:tcBorders>
-              <w:top w:val="nil"/>
-              <w:left w:val="nil"/>
-              <w:bottom w:val="single" w:sz="4" w:space="0" w:color="auto"/>
-              <w:right w:val="single" w:sz="4" w:space="0" w:color="auto"/>
-            </w:tcBorders>
-            <w:shd w:val="clear" w:color="FFFFCC" w:fill="FFFFFF"/>
-            <w:vAlign w:val="center"/>
-            <w:hideMark/>
-          </w:tcPr>
-          <w:p>
-            <w:pPr>
-              <w:rPr>
-                <w:color w:val="000000"/>
-                <w:sz w:val="24"/>
-                <w:szCs w:val="24"/>
-              </w:rPr>
-              <w:jc w:val="left"/>
-              <w:spacing w:before="40" w:after="40" w:line="240" w:lineRule="auto"/>
-            </w:pPr>
-            <w:r>
-              <w:rPr>
-                <w:color w:val="000000"/>
-                <w:sz w:val="24"/>
-                <w:szCs w:val="24"/>
-                <w:b w:val="0"/>
-              </w:rPr>
-              <w:t xml:space="preserve">Báo cáo thẩm định; Báo cáo tiếp thu, giải trình lần 6</w:t>
-            </w:r>
-          </w:p>
-        </w:tc>
-        <w:tc>
-          <w:tcPr>
-            <w:tcW w:w="2072" w:type="dxa"/>
-            <w:tcBorders>
-              <w:top w:val="nil"/>
-              <w:left w:val="nil"/>
-              <w:bottom w:val="single" w:sz="4" w:space="0" w:color="auto"/>
-              <w:right w:val="single" w:sz="4" w:space="0" w:color="auto"/>
-            </w:tcBorders>
-            <w:shd w:val="clear" w:color="FFFFCC" w:fill="FFFFFF"/>
-            <w:vAlign w:val="center"/>
-            <w:hideMark/>
-          </w:tcPr>
-          <w:p>
-            <w:pPr>
-              <w:rPr>
-                <w:color w:val="000000"/>
-                <w:sz w:val="24"/>
-                <w:szCs w:val="24"/>
-              </w:rPr>
-              <w:jc w:val="left"/>
-              <w:spacing w:before="40" w:after="40" w:line="240" w:lineRule="auto"/>
-            </w:pPr>
-            <w:r>
-              <w:rPr>
-                <w:color w:val="000000"/>
-                <w:sz w:val="24"/>
-                <w:szCs w:val="24"/>
-                <w:b w:val="0"/>
-              </w:rPr>
-              <w:t xml:space="preserve">Trước ngày 13/10/2026</w:t>
-            </w:r>
-          </w:p>
-        </w:tc>
-      </w:tr>
-      <w:tr>
-        <w:trPr>
-          <w:jc w:val="center"/>
-          <w:cantSplit/>
-        </w:trPr>
-        <w:tc>
-          <w:tcPr>
-            <w:tcW w:w="740" w:type="dxa"/>
-            <w:tcBorders>
-              <w:top w:val="nil"/>
-              <w:left w:val="nil"/>
-              <w:bottom w:val="single" w:sz="4" w:space="0" w:color="auto"/>
-              <w:right w:val="single" w:sz="4" w:space="0" w:color="auto"/>
-            </w:tcBorders>
-            <w:shd w:val="clear" w:color="FFFFCC" w:fill="FFFFFF"/>
-            <w:vAlign w:val="center"/>
-            <w:hideMark/>
-          </w:tcPr>
-          <w:p>
-            <w:pPr>
-              <w:rPr>
-                <w:color w:val="000000"/>
-                <w:sz w:val="24"/>
-                <w:szCs w:val="24"/>
-              </w:rPr>
-              <w:jc w:val="center"/>
-              <w:spacing w:before="40" w:after="40" w:line="240" w:lineRule="auto"/>
-            </w:pPr>
-            <w:r>
-              <w:rPr>
-                <w:color w:val="000000"/>
-                <w:sz w:val="24"/>
-                <w:szCs w:val="24"/>
-                <w:b w:val="0"/>
-              </w:rPr>
-              <w:t xml:space="preserve">1.5</w:t>
-            </w:r>
-          </w:p>
-        </w:tc>
-        <w:tc>
-          <w:tcPr>
-            <w:tcW w:w="4884" w:type="dxa"/>
-            <w:tcBorders>
-              <w:top w:val="nil"/>
-              <w:left w:val="nil"/>
-              <w:bottom w:val="single" w:sz="4" w:space="0" w:color="auto"/>
-              <w:right w:val="single" w:sz="4" w:space="0" w:color="auto"/>
-            </w:tcBorders>
-            <w:shd w:val="clear" w:color="FFFFCC" w:fill="FFFFFF"/>
-            <w:vAlign w:val="center"/>
-            <w:hideMark/>
-          </w:tcPr>
-          <w:p>
-            <w:pPr>
-              <w:rPr>
-                <w:color w:val="000000"/>
-                <w:sz w:val="24"/>
-                <w:szCs w:val="24"/>
-              </w:rPr>
-              <w:jc w:val="both"/>
-              <w:spacing w:before="40" w:after="40" w:line="240" w:lineRule="auto"/>
-            </w:pPr>
-            <w:r>
-              <w:rPr>
-                <w:color w:val="000000"/>
-                <w:sz w:val="24"/>
-                <w:szCs w:val="24"/>
-                <w:b w:val="0"/>
-              </w:rPr>
-              <w:t xml:space="preserve">Tổng hợp kết quả kiểm thử bản 1.3.13 đã thực hiện trên nền tảng Claude (trò chuyện), Claude Cowork (tài khoản cá nhân, tài khoản của phòng TH</w:t>
-              <w:noBreakHyphen/>
-              <w:t xml:space="preserve">HC&amp;QT) vào phiếu nghiệm thu</w:t>
-            </w:r>
-          </w:p>
-        </w:tc>
-        <w:tc>
-          <w:tcPr>
-            <w:tcW w:w="2368" w:type="dxa"/>
-            <w:tcBorders>
-              <w:top w:val="nil"/>
-              <w:left w:val="nil"/>
-              <w:bottom w:val="single" w:sz="4" w:space="0" w:color="auto"/>
-              <w:right w:val="single" w:sz="4" w:space="0" w:color="auto"/>
-            </w:tcBorders>
-            <w:shd w:val="clear" w:color="FFFFCC" w:fill="FFFFFF"/>
-            <w:vAlign w:val="center"/>
-            <w:hideMark/>
-          </w:tcPr>
-          <w:p>
-            <w:pPr>
-              <w:rPr>
-                <w:color w:val="000000"/>
-                <w:sz w:val="24"/>
-                <w:szCs w:val="24"/>
-              </w:rPr>
-              <w:jc w:val="left"/>
-              <w:spacing w:before="40" w:after="40" w:line="240" w:lineRule="auto"/>
-            </w:pPr>
-            <w:r>
-              <w:rPr>
-                <w:color w:val="000000"/>
-                <w:sz w:val="24"/>
-                <w:szCs w:val="24"/>
-                <w:b w:val="0"/>
-              </w:rPr>
-              <w:t xml:space="preserve">Phòng TH</w:t>
-              <w:noBreakHyphen/>
-              <w:t xml:space="preserve">HC&amp;QT</w:t>
-            </w:r>
-          </w:p>
-        </w:tc>
-        <w:tc>
-          <w:tcPr>
-            <w:tcW w:w="2516" w:type="dxa"/>
-            <w:tcBorders>
-              <w:top w:val="nil"/>
-              <w:left w:val="nil"/>
-              <w:bottom w:val="single" w:sz="4" w:space="0" w:color="auto"/>
-              <w:right w:val="single" w:sz="4" w:space="0" w:color="auto"/>
-            </w:tcBorders>
-            <w:shd w:val="clear" w:color="FFFFCC" w:fill="FFFFFF"/>
-            <w:vAlign w:val="center"/>
-            <w:hideMark/>
-          </w:tcPr>
-          <w:p>
-            <w:pPr>
-              <w:rPr>
-                <w:color w:val="000000"/>
-                <w:sz w:val="24"/>
-                <w:szCs w:val="24"/>
-              </w:rPr>
-              <w:jc w:val="left"/>
-              <w:spacing w:before="40" w:after="40" w:line="240" w:lineRule="auto"/>
-            </w:pPr>
-            <w:r>
-              <w:rPr>
-                <w:color w:val="000000"/>
-                <w:sz w:val="24"/>
-                <w:szCs w:val="24"/>
-                <w:b w:val="0"/>
-              </w:rPr>
-            </w:r>
-          </w:p>
-        </w:tc>
-        <w:tc>
-          <w:tcPr>
-            <w:tcW w:w="2220" w:type="dxa"/>
-            <w:tcBorders>
-              <w:top w:val="nil"/>
-              <w:left w:val="nil"/>
-              <w:bottom w:val="single" w:sz="4" w:space="0" w:color="auto"/>
-              <w:right w:val="single" w:sz="4" w:space="0" w:color="auto"/>
-            </w:tcBorders>
-            <w:shd w:val="clear" w:color="FFFFCC" w:fill="FFFFFF"/>
-            <w:vAlign w:val="center"/>
-            <w:hideMark/>
-          </w:tcPr>
-          <w:p>
-            <w:pPr>
-              <w:rPr>
-                <w:color w:val="000000"/>
-                <w:sz w:val="24"/>
-                <w:szCs w:val="24"/>
-              </w:rPr>
-              <w:jc w:val="left"/>
-              <w:spacing w:before="40" w:after="40" w:line="240" w:lineRule="auto"/>
-            </w:pPr>
-            <w:r>
-              <w:rPr>
-                <w:color w:val="000000"/>
-                <w:sz w:val="24"/>
-                <w:szCs w:val="24"/>
-                <w:b w:val="0"/>
-              </w:rPr>
-              <w:t xml:space="preserve">Phiếu nghiệm thu đã điền</w:t>
-            </w:r>
-          </w:p>
-        </w:tc>
-        <w:tc>
-          <w:tcPr>
-            <w:tcW w:w="2072" w:type="dxa"/>
-            <w:tcBorders>
-              <w:top w:val="nil"/>
-              <w:left w:val="nil"/>
-              <w:bottom w:val="single" w:sz="4" w:space="0" w:color="auto"/>
-              <w:right w:val="single" w:sz="4" w:space="0" w:color="auto"/>
-            </w:tcBorders>
-            <w:shd w:val="clear" w:color="FFFFCC" w:fill="FFFFFF"/>
-            <w:vAlign w:val="center"/>
-            <w:hideMark/>
-          </w:tcPr>
-          <w:p>
-            <w:pPr>
-              <w:rPr>
-                <w:color w:val="000000"/>
-                <w:sz w:val="24"/>
-                <w:szCs w:val="24"/>
-              </w:rPr>
-              <w:jc w:val="left"/>
-              <w:spacing w:before="40" w:after="40" w:line="240" w:lineRule="auto"/>
-            </w:pPr>
-            <w:r>
-              <w:rPr>
-                <w:color w:val="000000"/>
-                <w:sz w:val="24"/>
-                <w:szCs w:val="24"/>
-                <w:b w:val="0"/>
-              </w:rPr>
-              <w:t xml:space="preserve">Trước ngày 08/10/2026</w:t>
-            </w:r>
-          </w:p>
-        </w:tc>
-      </w:tr>
-      <w:tr>
-        <w:trPr>
-          <w:jc w:val="center"/>
-          <w:cantSplit/>
-        </w:trPr>
-        <w:tc>
-          <w:tcPr>
-            <w:tcW w:w="740" w:type="dxa"/>
-            <w:tcBorders>
-              <w:top w:val="nil"/>
-              <w:left w:val="nil"/>
-              <w:bottom w:val="single" w:sz="4" w:space="0" w:color="auto"/>
-              <w:right w:val="single" w:sz="4" w:space="0" w:color="auto"/>
-            </w:tcBorders>
-            <w:shd w:val="clear" w:color="FFFFCC" w:fill="FFFFFF"/>
-            <w:vAlign w:val="center"/>
-            <w:hideMark/>
-          </w:tcPr>
-          <w:p>
-            <w:pPr>
-              <w:rPr>
-                <w:color w:val="000000"/>
-                <w:sz w:val="24"/>
-                <w:szCs w:val="24"/>
-              </w:rPr>
-              <w:jc w:val="center"/>
-              <w:spacing w:before="40" w:after="40" w:line="240" w:lineRule="auto"/>
-            </w:pPr>
-            <w:r>
-              <w:rPr>
-                <w:color w:val="000000"/>
-                <w:sz w:val="24"/>
-                <w:szCs w:val="24"/>
-                <w:b w:val="0"/>
-              </w:rPr>
-              <w:t xml:space="preserve">1.6</w:t>
-            </w:r>
-          </w:p>
-        </w:tc>
-        <w:tc>
-          <w:tcPr>
-            <w:tcW w:w="4884" w:type="dxa"/>
-            <w:tcBorders>
-              <w:top w:val="nil"/>
-              <w:left w:val="nil"/>
-              <w:bottom w:val="single" w:sz="4" w:space="0" w:color="auto"/>
-              <w:right w:val="single" w:sz="4" w:space="0" w:color="auto"/>
-            </w:tcBorders>
-            <w:shd w:val="clear" w:color="FFFFCC" w:fill="FFFFFF"/>
-            <w:vAlign w:val="center"/>
-            <w:hideMark/>
-          </w:tcPr>
-          <w:p>
-            <w:pPr>
-              <w:rPr>
-                <w:color w:val="000000"/>
-                <w:sz w:val="24"/>
-                <w:szCs w:val="24"/>
-              </w:rPr>
-              <w:jc w:val="both"/>
-              <w:spacing w:before="40" w:after="40" w:line="240" w:lineRule="auto"/>
-            </w:pPr>
-            <w:r>
-              <w:rPr>
-                <w:color w:val="000000"/>
-                <w:sz w:val="24"/>
-                <w:szCs w:val="24"/>
-                <w:b w:val="0"/>
-              </w:rPr>
-              <w:t xml:space="preserve">Cử viên chức tham gia; hướng dẫn cài đặt, sử dụng Bộ công cụ</w:t>
-            </w:r>
-          </w:p>
-        </w:tc>
-        <w:tc>
-          <w:tcPr>
-            <w:tcW w:w="2368" w:type="dxa"/>
-            <w:tcBorders>
-              <w:top w:val="nil"/>
-              <w:left w:val="nil"/>
-              <w:bottom w:val="single" w:sz="4" w:space="0" w:color="auto"/>
-              <w:right w:val="single" w:sz="4" w:space="0" w:color="auto"/>
-            </w:tcBorders>
-            <w:shd w:val="clear" w:color="FFFFCC" w:fill="FFFFFF"/>
-            <w:vAlign w:val="center"/>
-            <w:hideMark/>
-          </w:tcPr>
-          <w:p>
-            <w:pPr>
-              <w:rPr>
-                <w:color w:val="000000"/>
-                <w:sz w:val="24"/>
-                <w:szCs w:val="24"/>
-              </w:rPr>
-              <w:jc w:val="left"/>
-              <w:spacing w:before="40" w:after="40" w:line="240" w:lineRule="auto"/>
-            </w:pPr>
-            <w:r>
-              <w:rPr>
-                <w:color w:val="000000"/>
-                <w:sz w:val="24"/>
-                <w:szCs w:val="24"/>
-                <w:b w:val="0"/>
-              </w:rPr>
-              <w:t xml:space="preserve">Phòng TH</w:t>
-              <w:noBreakHyphen/>
-              <w:t xml:space="preserve">HC&amp;QT</w:t>
-            </w:r>
-          </w:p>
-        </w:tc>
-        <w:tc>
-          <w:tcPr>
-            <w:tcW w:w="2516" w:type="dxa"/>
-            <w:tcBorders>
-              <w:top w:val="nil"/>
-              <w:left w:val="nil"/>
-              <w:bottom w:val="single" w:sz="4" w:space="0" w:color="auto"/>
-              <w:right w:val="single" w:sz="4" w:space="0" w:color="auto"/>
-            </w:tcBorders>
-            <w:shd w:val="clear" w:color="FFFFCC" w:fill="FFFFFF"/>
-            <w:vAlign w:val="center"/>
-            <w:hideMark/>
-          </w:tcPr>
-          <w:p>
-            <w:pPr>
-              <w:rPr>
-                <w:color w:val="000000"/>
-                <w:sz w:val="24"/>
-                <w:szCs w:val="24"/>
-              </w:rPr>
-              <w:jc w:val="left"/>
-              <w:spacing w:before="40" w:after="40" w:line="240" w:lineRule="auto"/>
-            </w:pPr>
-            <w:r>
-              <w:rPr>
-                <w:color w:val="000000"/>
-                <w:sz w:val="24"/>
-                <w:szCs w:val="24"/>
-                <w:b w:val="0"/>
-              </w:rPr>
-              <w:t xml:space="preserve">Đơn vị thí điểm</w:t>
-            </w:r>
-          </w:p>
-        </w:tc>
-        <w:tc>
-          <w:tcPr>
-            <w:tcW w:w="2220" w:type="dxa"/>
-            <w:tcBorders>
-              <w:top w:val="nil"/>
-              <w:left w:val="nil"/>
-              <w:bottom w:val="single" w:sz="4" w:space="0" w:color="auto"/>
-              <w:right w:val="single" w:sz="4" w:space="0" w:color="auto"/>
-            </w:tcBorders>
-            <w:shd w:val="clear" w:color="FFFFCC" w:fill="FFFFFF"/>
-            <w:vAlign w:val="center"/>
-            <w:hideMark/>
-          </w:tcPr>
-          <w:p>
-            <w:pPr>
-              <w:rPr>
-                <w:color w:val="000000"/>
-                <w:sz w:val="24"/>
-                <w:szCs w:val="24"/>
-              </w:rPr>
-              <w:jc w:val="left"/>
-              <w:spacing w:before="40" w:after="40" w:line="240" w:lineRule="auto"/>
-            </w:pPr>
-            <w:r>
-              <w:rPr>
-                <w:color w:val="000000"/>
-                <w:sz w:val="24"/>
-                <w:szCs w:val="24"/>
-                <w:b w:val="0"/>
-              </w:rPr>
-              <w:t xml:space="preserve">Danh sách viên chức; Bộ công cụ bản 1.3.13 được cài đặt</w:t>
-            </w:r>
-          </w:p>
-        </w:tc>
-        <w:tc>
-          <w:tcPr>
-            <w:tcW w:w="2072" w:type="dxa"/>
-            <w:tcBorders>
-              <w:top w:val="nil"/>
-              <w:left w:val="nil"/>
-              <w:bottom w:val="single" w:sz="4" w:space="0" w:color="auto"/>
-              <w:right w:val="single" w:sz="4" w:space="0" w:color="auto"/>
-            </w:tcBorders>
-            <w:shd w:val="clear" w:color="FFFFCC" w:fill="FFFFFF"/>
-            <w:vAlign w:val="center"/>
-            <w:hideMark/>
-          </w:tcPr>
-          <w:p>
-            <w:pPr>
-              <w:rPr>
-                <w:color w:val="000000"/>
-                <w:sz w:val="24"/>
-                <w:szCs w:val="24"/>
-              </w:rPr>
-              <w:jc w:val="left"/>
-              <w:spacing w:before="40" w:after="40" w:line="240" w:lineRule="auto"/>
-            </w:pPr>
-            <w:r>
-              <w:rPr>
-                <w:color w:val="000000"/>
-                <w:sz w:val="24"/>
-                <w:szCs w:val="24"/>
-                <w:b w:val="0"/>
-              </w:rPr>
-              <w:t xml:space="preserve">Danh sách trước ngày 09/10/2026; cài đặt trước ngày 13/10/2026</w:t>
-            </w:r>
-          </w:p>
-        </w:tc>
-      </w:tr>
-      <w:tr>
-        <w:trPr>
-          <w:jc w:val="center"/>
-          <w:cantSplit/>
-        </w:trPr>
-        <w:tc>
-          <w:tcPr>
-            <w:tcW w:w="740" w:type="dxa"/>
-            <w:tcBorders>
-              <w:top w:val="nil"/>
-              <w:left w:val="nil"/>
-              <w:bottom w:val="single" w:sz="4" w:space="0" w:color="auto"/>
-              <w:right w:val="single" w:sz="4" w:space="0" w:color="auto"/>
-            </w:tcBorders>
-            <w:shd w:val="clear" w:color="FFFFCC" w:fill="FFFFFF"/>
-            <w:vAlign w:val="center"/>
-            <w:hideMark/>
-          </w:tcPr>
-          <w:p>
-            <w:pPr>
-              <w:rPr>
-                <w:color w:val="000000"/>
-                <w:sz w:val="24"/>
-                <w:szCs w:val="24"/>
-              </w:rPr>
-              <w:jc w:val="center"/>
-              <w:spacing w:before="40" w:after="40" w:line="240" w:lineRule="auto"/>
-            </w:pPr>
-            <w:r>
-              <w:rPr>
-                <w:color w:val="000000"/>
-                <w:sz w:val="24"/>
-                <w:szCs w:val="24"/>
-                <w:b w:val="0"/>
-              </w:rPr>
-              <w:t xml:space="preserve">1.7</w:t>
             </w:r>
           </w:p>
         </w:tc>

</xml_diff>

<commit_message>
chuẩn: phụ lục .docx mỗi phụ lục một section, số trang từ 1, bỏ dòng Kèm theo (NĐ 30, 897 CL01/05); áp vào KH thí điểm
Co-Authored-By: Claude Opus 5.5 <noreply@anthropic.com>
</commit_message>
<xml_diff>
--- a/30-Ket-Qua/2026-10-05/Soan-Thao/KH_Thi-diem-co-kiem-soat-bo-cong-cu-AI-KTC-Quan-tri_20261005_v1.docx
+++ b/30-Ket-Qua/2026-10-05/Soan-Thao/KH_Thi-diem-co-kiem-soat-bo-cong-cu-AI-KTC-Quan-tri_20261005_v1.docx
@@ -1955,28 +1955,6 @@
         <w:t xml:space="preserve">QUAN</w:t>
         <w:noBreakHyphen/>
         <w:t xml:space="preserve">TRI</w:t>
-      </w:r>
-    </w:p>
-    <w:p>
-      <w:pPr>
-        <w:jc w:val="center"/>
-        <w:rPr>
-          <w:b/>
-          <w:bCs/>
-          <w:shd w:val="clear" w:color="auto" w:fill="FFFFFF"/>
-          <w:lang w:val="pl-PL"/>
-        </w:rPr>
-      </w:pPr>
-      <w:r>
-        <w:rPr>
-          <w:bCs/>
-          <w:shd w:val="clear" w:color="auto" w:fill="FFFFFF"/>
-          <w:lang w:val="pl-PL"/>
-          <w:i/>
-        </w:rPr>
-        <w:t xml:space="preserve">(Kèm theo Kế hoạch số       /KH</w:t>
-        <w:noBreakHyphen/>
-        <w:t xml:space="preserve">CĐKT ngày      tháng 10 năm 2026 của Trường Cao đẳng Kon Tum)</w:t>
       </w:r>
     </w:p>
     <w:p>
@@ -5460,7 +5438,17 @@
     </w:tbl>
     <w:p>
       <w:pPr>
-        <w:pageBreakBefore/>
+        <w:sectPr>
+          <w:pgSz w:w="16840" w:h="11907" w:orient="landscape" w:code="9"/>
+          <w:pgMar w:top="1134" w:right="851" w:bottom="1134" w:left="1134" w:header="720" w:footer="720" w:gutter="0"/>
+          <w:pgNumType w:start="1"/>
+          <w:cols w:space="720"/>
+          <w:docGrid w:linePitch="381"/>
+        </w:sectPr>
+      </w:pPr>
+    </w:p>
+    <w:p>
+      <w:pPr>
         <w:jc w:val="center"/>
         <w:rPr>
           <w:b/>
@@ -5496,28 +5484,6 @@
         <w:t xml:space="preserve">QUAN</w:t>
         <w:noBreakHyphen/>
         <w:t xml:space="preserve">TRI</w:t>
-      </w:r>
-    </w:p>
-    <w:p>
-      <w:pPr>
-        <w:jc w:val="center"/>
-        <w:rPr>
-          <w:b/>
-          <w:bCs/>
-          <w:shd w:val="clear" w:color="auto" w:fill="FFFFFF"/>
-          <w:lang w:val="pl-PL"/>
-        </w:rPr>
-      </w:pPr>
-      <w:r>
-        <w:rPr>
-          <w:bCs/>
-          <w:shd w:val="clear" w:color="auto" w:fill="FFFFFF"/>
-          <w:lang w:val="pl-PL"/>
-          <w:i/>
-        </w:rPr>
-        <w:t xml:space="preserve">(Kèm theo Kế hoạch số       /KH</w:t>
-        <w:noBreakHyphen/>
-        <w:t xml:space="preserve">CĐKT ngày      tháng 10 năm 2026 của Trường Cao đẳng Kon Tum)</w:t>
       </w:r>
     </w:p>
     <w:p>
@@ -7913,7 +7879,17 @@
     </w:tbl>
     <w:p>
       <w:pPr>
-        <w:pageBreakBefore/>
+        <w:sectPr>
+          <w:pgSz w:w="16840" w:h="11907" w:orient="landscape" w:code="9"/>
+          <w:pgMar w:top="1134" w:right="851" w:bottom="1134" w:left="1134" w:header="720" w:footer="720" w:gutter="0"/>
+          <w:pgNumType w:start="1"/>
+          <w:cols w:space="720"/>
+          <w:docGrid w:linePitch="381"/>
+        </w:sectPr>
+      </w:pPr>
+    </w:p>
+    <w:p>
+      <w:pPr>
         <w:jc w:val="center"/>
         <w:rPr>
           <w:b/>
@@ -7949,28 +7925,6 @@
         <w:t xml:space="preserve">QUAN</w:t>
         <w:noBreakHyphen/>
         <w:t xml:space="preserve">TRI</w:t>
-      </w:r>
-    </w:p>
-    <w:p>
-      <w:pPr>
-        <w:jc w:val="center"/>
-        <w:rPr>
-          <w:b/>
-          <w:bCs/>
-          <w:shd w:val="clear" w:color="auto" w:fill="FFFFFF"/>
-          <w:lang w:val="pl-PL"/>
-        </w:rPr>
-      </w:pPr>
-      <w:r>
-        <w:rPr>
-          <w:bCs/>
-          <w:shd w:val="clear" w:color="auto" w:fill="FFFFFF"/>
-          <w:lang w:val="pl-PL"/>
-          <w:i/>
-        </w:rPr>
-        <w:t xml:space="preserve">(Kèm theo Kế hoạch số       /KH</w:t>
-        <w:noBreakHyphen/>
-        <w:t xml:space="preserve">CĐKT ngày      tháng 10 năm 2026 của Trường Cao đẳng Kon Tum)</w:t>
       </w:r>
     </w:p>
     <w:p>

</xml_diff>